<commit_message>
Preserve every employer in CVs and repair ComparaSemplice chronology
Restore all nine documented companies in the ComparaSemplice CV, require complete dated employer coverage during validation and package reuse, and align preparation instructions. Verified the two-page DOCX visually, preserved unselected application artifacts, and passed 575 tests (17 skipped).
</commit_message>
<xml_diff>
--- a/registry/jobs/2026-10-04_183713_comparasemplice_it-senior-developer_86fa502f-23b7-4734-acfc-3821ef957d10/application/CV_ValentinNikolaev_comparasemplice_ITSeniorDeveloper.docx
+++ b/registry/jobs/2026-10-04_183713_comparasemplice_it-senior-developer_86fa502f-23b7-4734-acfc-3821ef957d10/application/CV_ValentinNikolaev_comparasemplice_ITSeniorDeveloper.docx
@@ -55,7 +55,7 @@
         </w:rPr>
         <w:t xml:space="preserve">Roma, Italia · +39 351 370 1194 · </w:t>
       </w:r>
-      <w:hyperlink w:history="1" r:id="rIdps5fsqmtlo5tge7je9dkg">
+      <w:hyperlink w:history="1" r:id="rIdb6ay75fxcvdrza9va7gsg">
         <w:r>
           <w:rPr>
             <w:rFonts w:ascii="Aptos" w:cs="Aptos" w:eastAsia="Aptos" w:hAnsi="Aptos"/>
@@ -85,7 +85,7 @@
         </w:rPr>
         <w:t xml:space="preserve">LinkedIn: </w:t>
       </w:r>
-      <w:hyperlink w:history="1" r:id="rIdrwsfxyov1g4a2ef3w28uz">
+      <w:hyperlink w:history="1" r:id="rIdzjwzosrbfjynzpit_q2ez">
         <w:r>
           <w:rPr>
             <w:rFonts w:ascii="Aptos" w:cs="Aptos" w:eastAsia="Aptos" w:hAnsi="Aptos"/>
@@ -108,7 +108,7 @@
         </w:rPr>
         <w:t xml:space="preserve"> · GitHub: </w:t>
       </w:r>
-      <w:hyperlink w:history="1" r:id="rIderdyi2ahqj6c08yixytlk">
+      <w:hyperlink w:history="1" r:id="rIdd9nzzhdva78_sgmqtcdho">
         <w:r>
           <w:rPr>
             <w:rFonts w:ascii="Aptos" w:cs="Aptos" w:eastAsia="Aptos" w:hAnsi="Aptos"/>
@@ -156,7 +156,7 @@
           <w:szCs w:val="24"/>
           <w:rtl w:val="false"/>
         </w:rPr>
-        <w:t xml:space="preserve">Senior backend engineer con oltre 15 anni di esperienza nello sviluppo di sistemi in produzione in PHP e Go. Lavoro su API, integrazioni, database SQL, automazione e sistemi event-driven, con attenzione concreta a sicurezza dei dati, affidabilità e manutenibilità. L'esperienza recente combina ownership tecnica di integrazioni PHP/Laravel per analytics e servizi esterni con piattaforme di supporto basate su API e canali conversazionali. Cerco un ruolo hands-on in cui contribuire alla progettazione e all'evoluzione di prodotti digitali affidabili.</w:t>
+        <w:t xml:space="preserve">Senior backend engineer con oltre 15 anni di esperienza nello sviluppo di sistemi in produzione in PHP e Go. Lavoro su API, integrazioni, database SQL e sistemi event-driven, con attenzione a sicurezza, affidabilità e manutenibilità. L'esperienza recente combina responsabilità tecnica su analytics e integrazioni PHP/Laravel con piattaforme di supporto basate su API e canali conversazionali.</w:t>
       </w:r>
     </w:p>
     <w:p>
@@ -253,46 +253,17 @@
           <w:szCs w:val="24"/>
           <w:rtl w:val="false"/>
         </w:rPr>
-        <w:t xml:space="preserve">Piattaforma e delivery:</w:t>
-      </w:r>
-      <w:r>
-        <w:rPr>
-          <w:rFonts w:ascii="Aptos" w:cs="Aptos" w:eastAsia="Aptos" w:hAnsi="Aptos"/>
-          <w:color w:val="000000"/>
-          <w:sz w:val="24"/>
-          <w:szCs w:val="24"/>
-          <w:rtl w:val="false"/>
-        </w:rPr>
-        <w:t xml:space="preserve"> AWS, Kubernetes, GitHub Actions, CI/CD</w:t>
-      </w:r>
-    </w:p>
-    <w:p>
-      <w:pPr>
-        <w:bidi w:val="false"/>
-        <w:spacing w:after="120" w:before="120" w:line="259.20000000000005"/>
-        <w:jc w:val="left"/>
-      </w:pPr>
-      <w:r>
-        <w:rPr>
-          <w:rFonts w:ascii="Aptos" w:cs="Aptos" w:eastAsia="Aptos" w:hAnsi="Aptos"/>
-          <w:b/>
-          <w:bCs/>
-          <w:color w:val="000000"/>
-          <w:sz w:val="24"/>
-          <w:szCs w:val="24"/>
-          <w:rtl w:val="false"/>
-        </w:rPr>
-        <w:t xml:space="preserve">Affidabilità e progettazione:</w:t>
-      </w:r>
-      <w:r>
-        <w:rPr>
-          <w:rFonts w:ascii="Aptos" w:cs="Aptos" w:eastAsia="Aptos" w:hAnsi="Aptos"/>
-          <w:color w:val="000000"/>
-          <w:sz w:val="24"/>
-          <w:szCs w:val="24"/>
-          <w:rtl w:val="false"/>
-        </w:rPr>
-        <w:t xml:space="preserve"> sistemi event-driven, RabbitMQ, monitoraggio</w:t>
+        <w:t xml:space="preserve">Piattaforma e affidabilità:</w:t>
+      </w:r>
+      <w:r>
+        <w:rPr>
+          <w:rFonts w:ascii="Aptos" w:cs="Aptos" w:eastAsia="Aptos" w:hAnsi="Aptos"/>
+          <w:color w:val="000000"/>
+          <w:sz w:val="24"/>
+          <w:szCs w:val="24"/>
+          <w:rtl w:val="false"/>
+        </w:rPr>
+        <w:t xml:space="preserve"> AWS, Kubernetes, GitHub Actions, CI/CD, RabbitMQ, monitoraggio</w:t>
       </w:r>
     </w:p>
     <w:p>
@@ -323,16 +294,16 @@
         <w:spacing w:after="120" w:before="240"/>
         <w:keepNext/>
       </w:pPr>
-      <w:bookmarkStart w:name="_Toc_Simplelife_Software_Developer_20232026_5" w:id="1"/>
-      <w:r>
-        <w:rPr>
-          <w:rFonts w:ascii="Aptos" w:cs="Aptos" w:eastAsia="Aptos" w:hAnsi="Aptos"/>
-          <w:color w:val="000000"/>
-          <w:sz w:val="24"/>
-          <w:szCs w:val="24"/>
-          <w:rtl w:val="false"/>
-        </w:rPr>
-        <w:t xml:space="preserve">Simple.life — Software Developer | 2023–2026</w:t>
+      <w:bookmarkStart w:name="_Toc_Simplelife_Software_Developer_November_2_5" w:id="1"/>
+      <w:r>
+        <w:rPr>
+          <w:rFonts w:ascii="Aptos" w:cs="Aptos" w:eastAsia="Aptos" w:hAnsi="Aptos"/>
+          <w:color w:val="000000"/>
+          <w:sz w:val="24"/>
+          <w:szCs w:val="24"/>
+          <w:rtl w:val="false"/>
+        </w:rPr>
+        <w:t xml:space="preserve">Simple.life — Software Developer | November 2023 – 2026</w:t>
       </w:r>
       <w:bookmarkEnd w:id="1"/>
     </w:p>
@@ -355,7 +326,7 @@
           <w:szCs w:val="24"/>
           <w:rtl w:val="false"/>
         </w:rPr>
-        <w:t xml:space="preserve">Progettato e portato in produzione una piattaforma di chiamate outbound su Amazon Connect, con architettura backend, controlli di accesso e protezioni per dati personali sottoposti a security sign-off.</w:t>
+        <w:t xml:space="preserve">Progettato e portato in produzione una piattaforma outbound su Amazon Connect, con architettura backend e protezioni dei dati personali sottoposte a security sign-off.</w:t>
       </w:r>
     </w:p>
     <w:p>
@@ -376,7 +347,7 @@
           <w:szCs w:val="24"/>
           <w:rtl w:val="false"/>
         </w:rPr>
-        <w:t xml:space="preserve">Realizzato un gateway Go multi-tenant che astrae Intercom e Zendesk dietro un modello eventi comune, con contratti OpenAPI, webhook e adapter per entrambi i servizi, abilitando la prima demo B2B dell'azienda per il prodotto di supporto AI.</w:t>
+        <w:t xml:space="preserve">Realizzato un gateway Go per Intercom e Zendesk con contratti OpenAPI e webhook, abilitando la prima demo B2B del prodotto di supporto AI.</w:t>
       </w:r>
     </w:p>
     <w:p>
@@ -397,8 +368,46 @@
           <w:szCs w:val="24"/>
           <w:rtl w:val="false"/>
         </w:rPr>
-        <w:t xml:space="preserve">Consolidato tre pipeline Snowflake–Intercom in un unico motore riutilizzabile, rimuovendo il limite di 100 elementi al giorno e le riletture quotidiane dell'intera cronologia senza interruzioni del servizio.</w:t>
-      </w:r>
+        <w:t xml:space="preserve">Consolidato tre pipeline Snowflake–Intercom, eliminando il limite di 100 elementi giornalieri e le riletture della cronologia senza interruzioni del servizio.</w:t>
+      </w:r>
+    </w:p>
+    <w:p>
+      <w:pPr>
+        <w:bidi w:val="false"/>
+        <w:spacing w:after="120" w:before="120" w:line="259.20000000000005"/>
+        <w:jc w:val="left"/>
+      </w:pPr>
+      <w:r>
+        <w:rPr>
+          <w:rFonts w:ascii="Aptos" w:cs="Aptos" w:eastAsia="Aptos" w:hAnsi="Aptos"/>
+          <w:color w:val="000000"/>
+          <w:sz w:val="24"/>
+          <w:szCs w:val="24"/>
+          <w:rtl w:val="false"/>
+        </w:rPr>
+        <w:t xml:space="preserve">Technologies: Go, PostgreSQL, AWS, Amazon Connect, Kubernetes, OpenAPI.</w:t>
+      </w:r>
+    </w:p>
+    <w:p>
+      <w:pPr>
+        <w:pStyle w:val="3"/>
+        <w:pStyle w:val="Heading3"/>
+        <w:bidi w:val="false"/>
+        <w:spacing w:after="120" w:before="240"/>
+        <w:keepNext/>
+      </w:pPr>
+      <w:bookmarkStart w:name="_Toc_CRURATED_PHP_Software_Developer_consulen_6" w:id="1"/>
+      <w:r>
+        <w:rPr>
+          <w:rFonts w:ascii="Aptos" w:cs="Aptos" w:eastAsia="Aptos" w:hAnsi="Aptos"/>
+          <w:color w:val="000000"/>
+          <w:sz w:val="24"/>
+          <w:szCs w:val="24"/>
+          <w:rtl w:val="false"/>
+        </w:rPr>
+        <w:t xml:space="preserve">CRURATED — PHP Software Developer, consulenza part-time parallela | August 2024 – January 2026</w:t>
+      </w:r>
+      <w:bookmarkEnd w:id="1"/>
     </w:p>
     <w:p>
       <w:pPr>
@@ -409,55 +418,18 @@
         </w:numPr>
         <w:bidi w:val="false"/>
         <w:spacing w:after="60" w:before="60"/>
-      </w:pPr>
-      <w:r>
-        <w:rPr>
-          <w:rFonts w:ascii="Aptos" w:cs="Aptos" w:eastAsia="Aptos" w:hAnsi="Aptos"/>
-          <w:color w:val="000000"/>
-          <w:sz w:val="24"/>
-          <w:szCs w:val="24"/>
-          <w:rtl w:val="false"/>
-        </w:rPr>
-        <w:t xml:space="preserve">Sviluppato strumenti backend per annullamenti, rimborsi, categorizzazione e gestione delle recensioni per il supporto clienti.</w:t>
-      </w:r>
-    </w:p>
-    <w:p>
-      <w:pPr>
-        <w:bidi w:val="false"/>
-        <w:spacing w:after="120" w:before="120" w:line="259.20000000000005"/>
-        <w:jc w:val="left"/>
-      </w:pPr>
-      <w:r>
-        <w:rPr>
-          <w:rFonts w:ascii="Aptos" w:cs="Aptos" w:eastAsia="Aptos" w:hAnsi="Aptos"/>
-          <w:color w:val="000000"/>
-          <w:sz w:val="24"/>
-          <w:szCs w:val="24"/>
-          <w:rtl w:val="false"/>
-        </w:rPr>
-        <w:t xml:space="preserve">Technologies: Go, PostgreSQL, AWS, Amazon Connect, SQS, Kubernetes, Intercom API, Zendesk API, Snowflake, OpenAPI.</w:t>
-      </w:r>
-    </w:p>
-    <w:p>
-      <w:pPr>
-        <w:pStyle w:val="3"/>
-        <w:pStyle w:val="Heading3"/>
-        <w:bidi w:val="false"/>
-        <w:spacing w:after="120" w:before="240"/>
         <w:keepNext/>
       </w:pPr>
-      <w:bookmarkStart w:name="_Toc_CRURATED_PHP_Software_Developer_incarico_6" w:id="1"/>
-      <w:r>
-        <w:rPr>
-          <w:rFonts w:ascii="Aptos" w:cs="Aptos" w:eastAsia="Aptos" w:hAnsi="Aptos"/>
-          <w:color w:val="000000"/>
-          <w:sz w:val="24"/>
-          <w:szCs w:val="24"/>
-          <w:rtl w:val="false"/>
-        </w:rPr>
-        <w:t xml:space="preserve">CRURATED — PHP Software Developer, incarico di consulenza part-time parallelo | 2024–2026</w:t>
-      </w:r>
-      <w:bookmarkEnd w:id="1"/>
+      <w:r>
+        <w:rPr>
+          <w:rFonts w:ascii="Aptos" w:cs="Aptos" w:eastAsia="Aptos" w:hAnsi="Aptos"/>
+          <w:color w:val="000000"/>
+          <w:sz w:val="24"/>
+          <w:szCs w:val="24"/>
+          <w:rtl w:val="false"/>
+        </w:rPr>
+        <w:t xml:space="preserve">Avuto piena responsabilità tecnica del DataLake e degli analytics in produzione, aumentando il throughput oltre 10x secondo Grafana e osservazione operativa.</w:t>
+      </w:r>
     </w:p>
     <w:p>
       <w:pPr>
@@ -468,17 +440,16 @@
         </w:numPr>
         <w:bidi w:val="false"/>
         <w:spacing w:after="60" w:before="60"/>
-        <w:keepNext/>
-      </w:pPr>
-      <w:r>
-        <w:rPr>
-          <w:rFonts w:ascii="Aptos" w:cs="Aptos" w:eastAsia="Aptos" w:hAnsi="Aptos"/>
-          <w:color w:val="000000"/>
-          <w:sz w:val="24"/>
-          <w:szCs w:val="24"/>
-          <w:rtl w:val="false"/>
-        </w:rPr>
-        <w:t xml:space="preserve">Avuto piena responsabilità tecnica del DataLake e dell'analytics degli eventi in produzione, con throughput aumentato di oltre 10x secondo Grafana e osservazione operativa.</w:t>
+      </w:pPr>
+      <w:r>
+        <w:rPr>
+          <w:rFonts w:ascii="Aptos" w:cs="Aptos" w:eastAsia="Aptos" w:hAnsi="Aptos"/>
+          <w:color w:val="000000"/>
+          <w:sz w:val="24"/>
+          <w:szCs w:val="24"/>
+          <w:rtl w:val="false"/>
+        </w:rPr>
+        <w:t xml:space="preserve">Reso modulare l'avvio dei nuovi stream analytics, riducendolo da alcuni giorni a meno di quattro ore.</w:t>
       </w:r>
     </w:p>
     <w:p>
@@ -499,8 +470,46 @@
           <w:szCs w:val="24"/>
           <w:rtl w:val="false"/>
         </w:rPr>
-        <w:t xml:space="preserve">Reso modulare la configurazione dei nuovi stream analytics, riducendo l'avvio da alcuni giorni a meno di quattro ore.</w:t>
-      </w:r>
+        <w:t xml:space="preserve">Realizzato la pubblicazione parallela delle versioni degli eventi, mantenendo la compatibilità durante l'evoluzione degli schemi in produzione.</w:t>
+      </w:r>
+    </w:p>
+    <w:p>
+      <w:pPr>
+        <w:bidi w:val="false"/>
+        <w:spacing w:after="120" w:before="120" w:line="259.20000000000005"/>
+        <w:jc w:val="left"/>
+      </w:pPr>
+      <w:r>
+        <w:rPr>
+          <w:rFonts w:ascii="Aptos" w:cs="Aptos" w:eastAsia="Aptos" w:hAnsi="Aptos"/>
+          <w:color w:val="000000"/>
+          <w:sz w:val="24"/>
+          <w:szCs w:val="24"/>
+          <w:rtl w:val="false"/>
+        </w:rPr>
+        <w:t xml:space="preserve">Technologies: PHP, Laravel, AWS, EventBridge, API REST, webhook.</w:t>
+      </w:r>
+    </w:p>
+    <w:p>
+      <w:pPr>
+        <w:pStyle w:val="3"/>
+        <w:pStyle w:val="Heading3"/>
+        <w:bidi w:val="false"/>
+        <w:spacing w:after="120" w:before="240"/>
+        <w:keepNext/>
+      </w:pPr>
+      <w:bookmarkStart w:name="_Toc_airSlate_Software_Developer_responsabili_7" w:id="1"/>
+      <w:r>
+        <w:rPr>
+          <w:rFonts w:ascii="Aptos" w:cs="Aptos" w:eastAsia="Aptos" w:hAnsi="Aptos"/>
+          <w:color w:val="000000"/>
+          <w:sz w:val="24"/>
+          <w:szCs w:val="24"/>
+          <w:rtl w:val="false"/>
+        </w:rPr>
+        <w:t xml:space="preserve">airSlate — Software Developer, responsabilità di backend lead | February 2021 – August 2023</w:t>
+      </w:r>
+      <w:bookmarkEnd w:id="1"/>
     </w:p>
     <w:p>
       <w:pPr>
@@ -511,16 +520,17 @@
         </w:numPr>
         <w:bidi w:val="false"/>
         <w:spacing w:after="60" w:before="60"/>
-      </w:pPr>
-      <w:r>
-        <w:rPr>
-          <w:rFonts w:ascii="Aptos" w:cs="Aptos" w:eastAsia="Aptos" w:hAnsi="Aptos"/>
-          <w:color w:val="000000"/>
-          <w:sz w:val="24"/>
-          <w:szCs w:val="24"/>
-          <w:rtl w:val="false"/>
-        </w:rPr>
-        <w:t xml:space="preserve">Realizzato la pubblicazione parallela di versioni degli eventi in produzione, mantenendo la compatibilità durante l'evoluzione degli schemi.</w:t>
+        <w:keepNext/>
+      </w:pPr>
+      <w:r>
+        <w:rPr>
+          <w:rFonts w:ascii="Aptos" w:cs="Aptos" w:eastAsia="Aptos" w:hAnsi="Aptos"/>
+          <w:color w:val="000000"/>
+          <w:sz w:val="24"/>
+          <w:szCs w:val="24"/>
+          <w:rtl w:val="false"/>
+        </w:rPr>
+        <w:t xml:space="preserve">Guidato il lavoro sulle prestazioni API, riducendo i tempi medi di risposta di circa il 30%, con misurazioni in Prometheus.</w:t>
       </w:r>
     </w:p>
     <w:p>
@@ -541,46 +551,8 @@
           <w:szCs w:val="24"/>
           <w:rtl w:val="false"/>
         </w:rPr>
-        <w:t xml:space="preserve">Gestito tecnicamente l'integrazione Crutrade in produzione: autenticazione e OTP, collegamento account, import/export delle collezioni, verifica della proprietà degli acquisti e logging delle richieste e risposte.</w:t>
-      </w:r>
-    </w:p>
-    <w:p>
-      <w:pPr>
-        <w:bidi w:val="false"/>
-        <w:spacing w:after="120" w:before="120" w:line="259.20000000000005"/>
-        <w:jc w:val="left"/>
-      </w:pPr>
-      <w:r>
-        <w:rPr>
-          <w:rFonts w:ascii="Aptos" w:cs="Aptos" w:eastAsia="Aptos" w:hAnsi="Aptos"/>
-          <w:color w:val="000000"/>
-          <w:sz w:val="24"/>
-          <w:szCs w:val="24"/>
-          <w:rtl w:val="false"/>
-        </w:rPr>
-        <w:t xml:space="preserve">Technologies: PHP, Laravel, AWS, EventBridge, code, API REST, webhook, S3.</w:t>
-      </w:r>
-    </w:p>
-    <w:p>
-      <w:pPr>
-        <w:pStyle w:val="3"/>
-        <w:pStyle w:val="Heading3"/>
-        <w:bidi w:val="false"/>
-        <w:spacing w:after="120" w:before="240"/>
-        <w:keepNext/>
-      </w:pPr>
-      <w:bookmarkStart w:name="_Toc_PDFfiller_Software_Developer_20162019_7" w:id="1"/>
-      <w:r>
-        <w:rPr>
-          <w:rFonts w:ascii="Aptos" w:cs="Aptos" w:eastAsia="Aptos" w:hAnsi="Aptos"/>
-          <w:color w:val="000000"/>
-          <w:sz w:val="24"/>
-          <w:szCs w:val="24"/>
-          <w:rtl w:val="false"/>
-        </w:rPr>
-        <w:t xml:space="preserve">PDFfiller — Software Developer | 2016–2019</w:t>
-      </w:r>
-      <w:bookmarkEnd w:id="1"/>
+        <w:t xml:space="preserve">Guidato il miglioramento delle pipeline CI/CD, accorciando i tempi di delivery di 11 minuti, circa il 70%.</w:t>
+      </w:r>
     </w:p>
     <w:p>
       <w:pPr>
@@ -591,18 +563,55 @@
         </w:numPr>
         <w:bidi w:val="false"/>
         <w:spacing w:after="60" w:before="60"/>
+      </w:pPr>
+      <w:r>
+        <w:rPr>
+          <w:rFonts w:ascii="Aptos" w:cs="Aptos" w:eastAsia="Aptos" w:hAnsi="Aptos"/>
+          <w:color w:val="000000"/>
+          <w:sz w:val="24"/>
+          <w:szCs w:val="24"/>
+          <w:rtl w:val="false"/>
+        </w:rPr>
+        <w:t xml:space="preserve">Coordinato il lavoro backend e seguito le metriche del team, aumentando il ritmo di consegna delle funzionalità di circa il 20%.</w:t>
+      </w:r>
+    </w:p>
+    <w:p>
+      <w:pPr>
+        <w:bidi w:val="false"/>
+        <w:spacing w:after="120" w:before="120" w:line="259.20000000000005"/>
+        <w:jc w:val="left"/>
+      </w:pPr>
+      <w:r>
+        <w:rPr>
+          <w:rFonts w:ascii="Aptos" w:cs="Aptos" w:eastAsia="Aptos" w:hAnsi="Aptos"/>
+          <w:color w:val="000000"/>
+          <w:sz w:val="24"/>
+          <w:szCs w:val="24"/>
+          <w:rtl w:val="false"/>
+        </w:rPr>
+        <w:t xml:space="preserve">Technologies: PHP, Laravel, MySQL, Prometheus, API REST, CI/CD.</w:t>
+      </w:r>
+    </w:p>
+    <w:p>
+      <w:pPr>
+        <w:pStyle w:val="3"/>
+        <w:pStyle w:val="Heading3"/>
+        <w:bidi w:val="false"/>
+        <w:spacing w:after="120" w:before="240"/>
         <w:keepNext/>
       </w:pPr>
-      <w:r>
-        <w:rPr>
-          <w:rFonts w:ascii="Aptos" w:cs="Aptos" w:eastAsia="Aptos" w:hAnsi="Aptos"/>
-          <w:color w:val="000000"/>
-          <w:sz w:val="24"/>
-          <w:szCs w:val="24"/>
-          <w:rtl w:val="false"/>
-        </w:rPr>
-        <w:t xml:space="preserve">Guidato cinque backend engineer nello sviluppo di un servizio di email transazionali ad alto volume.</w:t>
-      </w:r>
+      <w:bookmarkStart w:name="_Toc_Hyprr_Technical_Lead_November_2019_Janua_8" w:id="1"/>
+      <w:r>
+        <w:rPr>
+          <w:rFonts w:ascii="Aptos" w:cs="Aptos" w:eastAsia="Aptos" w:hAnsi="Aptos"/>
+          <w:color w:val="000000"/>
+          <w:sz w:val="24"/>
+          <w:szCs w:val="24"/>
+          <w:rtl w:val="false"/>
+        </w:rPr>
+        <w:t xml:space="preserve">Hyprr — Technical Lead | November 2019 – January 2021</w:t>
+      </w:r>
+      <w:bookmarkEnd w:id="1"/>
     </w:p>
     <w:p>
       <w:pPr>
@@ -613,33 +622,136 @@
         </w:numPr>
         <w:bidi w:val="false"/>
         <w:spacing w:after="60" w:before="60"/>
-      </w:pPr>
-      <w:r>
-        <w:rPr>
-          <w:rFonts w:ascii="Aptos" w:cs="Aptos" w:eastAsia="Aptos" w:hAnsi="Aptos"/>
-          <w:color w:val="000000"/>
-          <w:sz w:val="24"/>
-          <w:szCs w:val="24"/>
-          <w:rtl w:val="false"/>
-        </w:rPr>
-        <w:t xml:space="preserve">Preparato il servizio per circa 3 milioni di email mensili e per picchi BFCM fino a dieci volte il traffico ordinario, con attenzione a capacità e affidabilità della messaggistica.</w:t>
-      </w:r>
-    </w:p>
-    <w:p>
-      <w:pPr>
-        <w:bidi w:val="false"/>
-        <w:spacing w:after="120" w:before="120" w:line="259.20000000000005"/>
-        <w:jc w:val="left"/>
-      </w:pPr>
-      <w:r>
-        <w:rPr>
-          <w:rFonts w:ascii="Aptos" w:cs="Aptos" w:eastAsia="Aptos" w:hAnsi="Aptos"/>
-          <w:color w:val="000000"/>
-          <w:sz w:val="24"/>
-          <w:szCs w:val="24"/>
-          <w:rtl w:val="false"/>
-        </w:rPr>
-        <w:t xml:space="preserve">Technologies: PHP, Laravel, MySQL, RabbitMQ, infrastruttura email, DNS, DKIM, SPF, DMARC.</w:t>
+        <w:keepNext/>
+      </w:pPr>
+      <w:r>
+        <w:rPr>
+          <w:rFonts w:ascii="Aptos" w:cs="Aptos" w:eastAsia="Aptos" w:hAnsi="Aptos"/>
+          <w:color w:val="000000"/>
+          <w:sz w:val="24"/>
+          <w:szCs w:val="24"/>
+          <w:rtl w:val="false"/>
+        </w:rPr>
+        <w:t xml:space="preserve">Portato il prodotto dal prototipo alla closed beta in meno di sei mesi.</w:t>
+      </w:r>
+    </w:p>
+    <w:p>
+      <w:pPr>
+        <w:pStyle w:val="ListParagraph"/>
+        <w:numPr>
+          <w:ilvl w:val="0"/>
+          <w:numId w:val="1"/>
+        </w:numPr>
+        <w:bidi w:val="false"/>
+        <w:spacing w:after="60" w:before="60"/>
+      </w:pPr>
+      <w:r>
+        <w:rPr>
+          <w:rFonts w:ascii="Aptos" w:cs="Aptos" w:eastAsia="Aptos" w:hAnsi="Aptos"/>
+          <w:color w:val="000000"/>
+          <w:sz w:val="24"/>
+          <w:szCs w:val="24"/>
+          <w:rtl w:val="false"/>
+        </w:rPr>
+        <w:t xml:space="preserve">Definito con il CTO lo stack e la roadmap tecnologica, guidando lo sviluppo backend del prodotto con microservizi e serverless.</w:t>
+      </w:r>
+    </w:p>
+    <w:p>
+      <w:pPr>
+        <w:bidi w:val="false"/>
+        <w:spacing w:after="120" w:before="120" w:line="259.20000000000005"/>
+        <w:jc w:val="left"/>
+      </w:pPr>
+      <w:r>
+        <w:rPr>
+          <w:rFonts w:ascii="Aptos" w:cs="Aptos" w:eastAsia="Aptos" w:hAnsi="Aptos"/>
+          <w:color w:val="000000"/>
+          <w:sz w:val="24"/>
+          <w:szCs w:val="24"/>
+          <w:rtl w:val="false"/>
+        </w:rPr>
+        <w:t xml:space="preserve">Technologies: PHP, Go, Laravel, MySQL, AWS, microservizi.</w:t>
+      </w:r>
+    </w:p>
+    <w:p>
+      <w:pPr>
+        <w:pStyle w:val="3"/>
+        <w:pStyle w:val="Heading3"/>
+        <w:bidi w:val="false"/>
+        <w:spacing w:after="120" w:before="240"/>
+        <w:keepNext/>
+      </w:pPr>
+      <w:bookmarkStart w:name="_Toc_PDFfiller_Software_Developer_October_201_9" w:id="1"/>
+      <w:r>
+        <w:rPr>
+          <w:rFonts w:ascii="Aptos" w:cs="Aptos" w:eastAsia="Aptos" w:hAnsi="Aptos"/>
+          <w:color w:val="000000"/>
+          <w:sz w:val="24"/>
+          <w:szCs w:val="24"/>
+          <w:rtl w:val="false"/>
+        </w:rPr>
+        <w:t xml:space="preserve">PDFfiller — Software Developer | October 2016 – November 2019</w:t>
+      </w:r>
+      <w:bookmarkEnd w:id="1"/>
+    </w:p>
+    <w:p>
+      <w:pPr>
+        <w:pStyle w:val="ListParagraph"/>
+        <w:numPr>
+          <w:ilvl w:val="0"/>
+          <w:numId w:val="1"/>
+        </w:numPr>
+        <w:bidi w:val="false"/>
+        <w:spacing w:after="60" w:before="60"/>
+        <w:keepNext/>
+      </w:pPr>
+      <w:r>
+        <w:rPr>
+          <w:rFonts w:ascii="Aptos" w:cs="Aptos" w:eastAsia="Aptos" w:hAnsi="Aptos"/>
+          <w:color w:val="000000"/>
+          <w:sz w:val="24"/>
+          <w:szCs w:val="24"/>
+          <w:rtl w:val="false"/>
+        </w:rPr>
+        <w:t xml:space="preserve">Guidato cinque backend engineer nello sviluppo del servizio di email transazionali.</w:t>
+      </w:r>
+    </w:p>
+    <w:p>
+      <w:pPr>
+        <w:pStyle w:val="ListParagraph"/>
+        <w:numPr>
+          <w:ilvl w:val="0"/>
+          <w:numId w:val="1"/>
+        </w:numPr>
+        <w:bidi w:val="false"/>
+        <w:spacing w:after="60" w:before="60"/>
+      </w:pPr>
+      <w:r>
+        <w:rPr>
+          <w:rFonts w:ascii="Aptos" w:cs="Aptos" w:eastAsia="Aptos" w:hAnsi="Aptos"/>
+          <w:color w:val="000000"/>
+          <w:sz w:val="24"/>
+          <w:szCs w:val="24"/>
+          <w:rtl w:val="false"/>
+        </w:rPr>
+        <w:t xml:space="preserve">Preparato il servizio per circa 3 milioni di email mensili e picchi BFCM fino a 10x, curando capacità e affidabilità.</w:t>
+      </w:r>
+    </w:p>
+    <w:p>
+      <w:pPr>
+        <w:bidi w:val="false"/>
+        <w:spacing w:after="120" w:before="120" w:line="259.20000000000005"/>
+        <w:jc w:val="left"/>
+      </w:pPr>
+      <w:r>
+        <w:rPr>
+          <w:rFonts w:ascii="Aptos" w:cs="Aptos" w:eastAsia="Aptos" w:hAnsi="Aptos"/>
+          <w:color w:val="000000"/>
+          <w:sz w:val="24"/>
+          <w:szCs w:val="24"/>
+          <w:rtl w:val="false"/>
+        </w:rPr>
+        <w:t xml:space="preserve">Technologies: PHP, Laravel, MySQL, RabbitMQ, DNS, DKIM, SPF, DMARC.</w:t>
       </w:r>
     </w:p>
     <w:p>
@@ -649,7 +761,7 @@
         <w:bidi w:val="false"/>
         <w:spacing w:after="120" w:before="240"/>
       </w:pPr>
-      <w:bookmarkStart w:name="_Toc_Education_8" w:id="1"/>
+      <w:bookmarkStart w:name="_Toc_Additional_Experience_10" w:id="1"/>
       <w:r>
         <w:rPr>
           <w:rFonts w:ascii="Aptos" w:cs="Aptos" w:eastAsia="Aptos" w:hAnsi="Aptos"/>
@@ -658,6 +770,94 @@
           <w:szCs w:val="28"/>
           <w:rtl w:val="false"/>
         </w:rPr>
+        <w:t xml:space="preserve">Additional Experience</w:t>
+      </w:r>
+      <w:bookmarkEnd w:id="1"/>
+    </w:p>
+    <w:p>
+      <w:pPr>
+        <w:bidi w:val="false"/>
+        <w:spacing w:after="120" w:before="120" w:line="259.20000000000005"/>
+        <w:jc w:val="left"/>
+      </w:pPr>
+      <w:r>
+        <w:rPr>
+          <w:rFonts w:ascii="Aptos" w:cs="Aptos" w:eastAsia="Aptos" w:hAnsi="Aptos"/>
+          <w:color w:val="000000"/>
+          <w:sz w:val="24"/>
+          <w:szCs w:val="24"/>
+          <w:rtl w:val="false"/>
+        </w:rPr>
+        <w:t xml:space="preserve">Sixt — Senior Software Developer | December 2018 – November 2019</w:t>
+      </w:r>
+    </w:p>
+    <w:p>
+      <w:pPr>
+        <w:bidi w:val="false"/>
+        <w:spacing w:after="120" w:before="120" w:line="259.20000000000005"/>
+        <w:jc w:val="left"/>
+      </w:pPr>
+      <w:r>
+        <w:rPr>
+          <w:rFonts w:ascii="Aptos" w:cs="Aptos" w:eastAsia="Aptos" w:hAnsi="Aptos"/>
+          <w:color w:val="000000"/>
+          <w:sz w:val="24"/>
+          <w:szCs w:val="24"/>
+          <w:rtl w:val="false"/>
+        </w:rPr>
+        <w:t xml:space="preserve">Aurum Software — Senior Software Developer | November 2015 – November 2016</w:t>
+      </w:r>
+    </w:p>
+    <w:p>
+      <w:pPr>
+        <w:bidi w:val="false"/>
+        <w:spacing w:after="120" w:before="120" w:line="259.20000000000005"/>
+        <w:jc w:val="left"/>
+      </w:pPr>
+      <w:r>
+        <w:rPr>
+          <w:rFonts w:ascii="Aptos" w:cs="Aptos" w:eastAsia="Aptos" w:hAnsi="Aptos"/>
+          <w:color w:val="000000"/>
+          <w:sz w:val="24"/>
+          <w:szCs w:val="24"/>
+          <w:rtl w:val="false"/>
+        </w:rPr>
+        <w:t xml:space="preserve">Upwork freelance — Software Developer | July 2008 – September 2016</w:t>
+      </w:r>
+    </w:p>
+    <w:p>
+      <w:pPr>
+        <w:bidi w:val="false"/>
+        <w:spacing w:after="120" w:before="120" w:line="259.20000000000005"/>
+        <w:jc w:val="left"/>
+      </w:pPr>
+      <w:r>
+        <w:rPr>
+          <w:rFonts w:ascii="Aptos" w:cs="Aptos" w:eastAsia="Aptos" w:hAnsi="Aptos"/>
+          <w:color w:val="000000"/>
+          <w:sz w:val="24"/>
+          <w:szCs w:val="24"/>
+          <w:rtl w:val="false"/>
+        </w:rPr>
+        <w:t xml:space="preserve">CoinsBank/bit-x — Senior Software Developer | January 2014 – November 2015</w:t>
+      </w:r>
+    </w:p>
+    <w:p>
+      <w:pPr>
+        <w:pStyle w:val="2"/>
+        <w:pStyle w:val="Heading2"/>
+        <w:bidi w:val="false"/>
+        <w:spacing w:after="120" w:before="240"/>
+      </w:pPr>
+      <w:bookmarkStart w:name="_Toc_Education_11" w:id="1"/>
+      <w:r>
+        <w:rPr>
+          <w:rFonts w:ascii="Aptos" w:cs="Aptos" w:eastAsia="Aptos" w:hAnsi="Aptos"/>
+          <w:color w:val="000000"/>
+          <w:sz w:val="28"/>
+          <w:szCs w:val="28"/>
+          <w:rtl w:val="false"/>
+        </w:rPr>
         <w:t xml:space="preserve">Education</w:t>
       </w:r>
       <w:bookmarkEnd w:id="1"/>
@@ -698,7 +898,7 @@
         <w:bidi w:val="false"/>
         <w:spacing w:after="120" w:before="240"/>
       </w:pPr>
-      <w:bookmarkStart w:name="_Toc_Languages_9" w:id="1"/>
+      <w:bookmarkStart w:name="_Toc_Languages_12" w:id="1"/>
       <w:r>
         <w:rPr>
           <w:rFonts w:ascii="Aptos" w:cs="Aptos" w:eastAsia="Aptos" w:hAnsi="Aptos"/>

</xml_diff>

<commit_message>
Keep all CV employers in one Experience section
Remove the unsolicited Additional Experience section, use consistent dated role headings and separated Markdown list items, and allow older dated-only employer entries within the same chronology. Preserve all nine companies and existing claims. Visually reviewed the two-page Word export and passed 586 tests with 17 skipped.
</commit_message>
<xml_diff>
--- a/registry/jobs/2026-10-04_183713_comparasemplice_it-senior-developer_86fa502f-23b7-4734-acfc-3821ef957d10/application/CV_ValentinNikolaev_comparasemplice_ITSeniorDeveloper.docx
+++ b/registry/jobs/2026-10-04_183713_comparasemplice_it-senior-developer_86fa502f-23b7-4734-acfc-3821ef957d10/application/CV_ValentinNikolaev_comparasemplice_ITSeniorDeveloper.docx
@@ -55,7 +55,7 @@
         </w:rPr>
         <w:t xml:space="preserve">Roma, Italia · +39 351 370 1194 · </w:t>
       </w:r>
-      <w:hyperlink w:history="1" r:id="rIdb6ay75fxcvdrza9va7gsg">
+      <w:hyperlink w:history="1" r:id="rIdzmkjr_lbxza5lvaf-bvdr">
         <w:r>
           <w:rPr>
             <w:rFonts w:ascii="Aptos" w:cs="Aptos" w:eastAsia="Aptos" w:hAnsi="Aptos"/>
@@ -85,7 +85,7 @@
         </w:rPr>
         <w:t xml:space="preserve">LinkedIn: </w:t>
       </w:r>
-      <w:hyperlink w:history="1" r:id="rIdzjwzosrbfjynzpit_q2ez">
+      <w:hyperlink w:history="1" r:id="rIdz4dnq1eqray0aaectee5h">
         <w:r>
           <w:rPr>
             <w:rFonts w:ascii="Aptos" w:cs="Aptos" w:eastAsia="Aptos" w:hAnsi="Aptos"/>
@@ -108,7 +108,7 @@
         </w:rPr>
         <w:t xml:space="preserve"> · GitHub: </w:t>
       </w:r>
-      <w:hyperlink w:history="1" r:id="rIdd9nzzhdva78_sgmqtcdho">
+      <w:hyperlink w:history="1" r:id="rId4dkq_tb44iy1ildtxpdcw">
         <w:r>
           <w:rPr>
             <w:rFonts w:ascii="Aptos" w:cs="Aptos" w:eastAsia="Aptos" w:hAnsi="Aptos"/>
@@ -681,7 +681,28 @@
         <w:spacing w:after="120" w:before="240"/>
         <w:keepNext/>
       </w:pPr>
-      <w:bookmarkStart w:name="_Toc_PDFfiller_Software_Developer_October_201_9" w:id="1"/>
+      <w:bookmarkStart w:name="_Toc_Sixt_Senior_Software_Developer_December__9" w:id="1"/>
+      <w:r>
+        <w:rPr>
+          <w:rFonts w:ascii="Aptos" w:cs="Aptos" w:eastAsia="Aptos" w:hAnsi="Aptos"/>
+          <w:color w:val="000000"/>
+          <w:sz w:val="24"/>
+          <w:szCs w:val="24"/>
+          <w:rtl w:val="false"/>
+        </w:rPr>
+        <w:t xml:space="preserve">Sixt — Senior Software Developer | December 2018 – November 2019</w:t>
+      </w:r>
+      <w:bookmarkEnd w:id="1"/>
+    </w:p>
+    <w:p>
+      <w:pPr>
+        <w:pStyle w:val="3"/>
+        <w:pStyle w:val="Heading3"/>
+        <w:bidi w:val="false"/>
+        <w:spacing w:after="120" w:before="240"/>
+        <w:keepNext/>
+      </w:pPr>
+      <w:bookmarkStart w:name="_Toc_PDFfiller_Software_Developer_October_201_10" w:id="1"/>
       <w:r>
         <w:rPr>
           <w:rFonts w:ascii="Aptos" w:cs="Aptos" w:eastAsia="Aptos" w:hAnsi="Aptos"/>
@@ -756,12 +777,76 @@
     </w:p>
     <w:p>
       <w:pPr>
+        <w:pStyle w:val="3"/>
+        <w:pStyle w:val="Heading3"/>
+        <w:bidi w:val="false"/>
+        <w:spacing w:after="120" w:before="240"/>
+        <w:keepNext/>
+      </w:pPr>
+      <w:bookmarkStart w:name="_Toc_Aurum_Software_Senior_Software_Developer_11" w:id="1"/>
+      <w:r>
+        <w:rPr>
+          <w:rFonts w:ascii="Aptos" w:cs="Aptos" w:eastAsia="Aptos" w:hAnsi="Aptos"/>
+          <w:color w:val="000000"/>
+          <w:sz w:val="24"/>
+          <w:szCs w:val="24"/>
+          <w:rtl w:val="false"/>
+        </w:rPr>
+        <w:t xml:space="preserve">Aurum Software — Senior Software Developer | November 2015 – November 2016</w:t>
+      </w:r>
+      <w:bookmarkEnd w:id="1"/>
+    </w:p>
+    <w:p>
+      <w:pPr>
+        <w:pStyle w:val="3"/>
+        <w:pStyle w:val="Heading3"/>
+        <w:bidi w:val="false"/>
+        <w:spacing w:after="120" w:before="240"/>
+        <w:keepNext/>
+      </w:pPr>
+      <w:bookmarkStart w:name="_Toc_Upwork_freelance_Software_Developer_July_12" w:id="1"/>
+      <w:r>
+        <w:rPr>
+          <w:rFonts w:ascii="Aptos" w:cs="Aptos" w:eastAsia="Aptos" w:hAnsi="Aptos"/>
+          <w:color w:val="000000"/>
+          <w:sz w:val="24"/>
+          <w:szCs w:val="24"/>
+          <w:rtl w:val="false"/>
+        </w:rPr>
+        <w:t xml:space="preserve">Upwork freelance — Software Developer | July 2008 – September 2016</w:t>
+      </w:r>
+      <w:bookmarkEnd w:id="1"/>
+    </w:p>
+    <w:p>
+      <w:pPr>
+        <w:pStyle w:val="3"/>
+        <w:pStyle w:val="Heading3"/>
+        <w:bidi w:val="false"/>
+        <w:spacing w:after="120" w:before="240"/>
+        <w:keepNext/>
+      </w:pPr>
+      <w:bookmarkStart w:name="_Toc_CoinsBankbitx_Senior_Software_Developer__13" w:id="1"/>
+      <w:r>
+        <w:rPr>
+          <w:rFonts w:ascii="Aptos" w:cs="Aptos" w:eastAsia="Aptos" w:hAnsi="Aptos"/>
+          <w:color w:val="000000"/>
+          <w:sz w:val="24"/>
+          <w:szCs w:val="24"/>
+          <w:rtl w:val="false"/>
+        </w:rPr>
+        <w:t xml:space="preserve">CoinsBank/bit-x — Senior Software Developer | January 2014 – November 2015</w:t>
+      </w:r>
+      <w:bookmarkEnd w:id="1"/>
+    </w:p>
+    <w:p>
+      <w:pPr>
         <w:pStyle w:val="2"/>
         <w:pStyle w:val="Heading2"/>
         <w:bidi w:val="false"/>
         <w:spacing w:after="120" w:before="240"/>
-      </w:pPr>
-      <w:bookmarkStart w:name="_Toc_Additional_Experience_10" w:id="1"/>
+        <w:keepNext/>
+      </w:pPr>
+      <w:bookmarkStart w:name="_Toc_Education_14" w:id="1"/>
       <w:r>
         <w:rPr>
           <w:rFonts w:ascii="Aptos" w:cs="Aptos" w:eastAsia="Aptos" w:hAnsi="Aptos"/>
@@ -770,7 +855,7 @@
           <w:szCs w:val="28"/>
           <w:rtl w:val="false"/>
         </w:rPr>
-        <w:t xml:space="preserve">Additional Experience</w:t>
+        <w:t xml:space="preserve">Education</w:t>
       </w:r>
       <w:bookmarkEnd w:id="1"/>
     </w:p>
@@ -783,63 +868,24 @@
       <w:r>
         <w:rPr>
           <w:rFonts w:ascii="Aptos" w:cs="Aptos" w:eastAsia="Aptos" w:hAnsi="Aptos"/>
-          <w:color w:val="000000"/>
-          <w:sz w:val="24"/>
-          <w:szCs w:val="24"/>
-          <w:rtl w:val="false"/>
-        </w:rPr>
-        <w:t xml:space="preserve">Sixt — Senior Software Developer | December 2018 – November 2019</w:t>
-      </w:r>
-    </w:p>
-    <w:p>
-      <w:pPr>
-        <w:bidi w:val="false"/>
-        <w:spacing w:after="120" w:before="120" w:line="259.20000000000005"/>
-        <w:jc w:val="left"/>
-      </w:pPr>
-      <w:r>
-        <w:rPr>
-          <w:rFonts w:ascii="Aptos" w:cs="Aptos" w:eastAsia="Aptos" w:hAnsi="Aptos"/>
-          <w:color w:val="000000"/>
-          <w:sz w:val="24"/>
-          <w:szCs w:val="24"/>
-          <w:rtl w:val="false"/>
-        </w:rPr>
-        <w:t xml:space="preserve">Aurum Software — Senior Software Developer | November 2015 – November 2016</w:t>
-      </w:r>
-    </w:p>
-    <w:p>
-      <w:pPr>
-        <w:bidi w:val="false"/>
-        <w:spacing w:after="120" w:before="120" w:line="259.20000000000005"/>
-        <w:jc w:val="left"/>
-      </w:pPr>
-      <w:r>
-        <w:rPr>
-          <w:rFonts w:ascii="Aptos" w:cs="Aptos" w:eastAsia="Aptos" w:hAnsi="Aptos"/>
-          <w:color w:val="000000"/>
-          <w:sz w:val="24"/>
-          <w:szCs w:val="24"/>
-          <w:rtl w:val="false"/>
-        </w:rPr>
-        <w:t xml:space="preserve">Upwork freelance — Software Developer | July 2008 – September 2016</w:t>
-      </w:r>
-    </w:p>
-    <w:p>
-      <w:pPr>
-        <w:bidi w:val="false"/>
-        <w:spacing w:after="120" w:before="120" w:line="259.20000000000005"/>
-        <w:jc w:val="left"/>
-      </w:pPr>
-      <w:r>
-        <w:rPr>
-          <w:rFonts w:ascii="Aptos" w:cs="Aptos" w:eastAsia="Aptos" w:hAnsi="Aptos"/>
-          <w:color w:val="000000"/>
-          <w:sz w:val="24"/>
-          <w:szCs w:val="24"/>
-          <w:rtl w:val="false"/>
-        </w:rPr>
-        <w:t xml:space="preserve">CoinsBank/bit-x — Senior Software Developer | January 2014 – November 2015</w:t>
+          <w:b/>
+          <w:bCs/>
+          <w:color w:val="000000"/>
+          <w:sz w:val="24"/>
+          <w:szCs w:val="24"/>
+          <w:rtl w:val="false"/>
+        </w:rPr>
+        <w:t xml:space="preserve">MSc in Computer Science</w:t>
+      </w:r>
+      <w:r>
+        <w:rPr>
+          <w:rFonts w:ascii="Aptos" w:cs="Aptos" w:eastAsia="Aptos" w:hAnsi="Aptos"/>
+          <w:color w:val="000000"/>
+          <w:sz w:val="24"/>
+          <w:szCs w:val="24"/>
+          <w:rtl w:val="false"/>
+        </w:rPr>
+        <w:t xml:space="preserve">, National Technical University, Kharkiv, Ucraina — 2003–2008</w:t>
       </w:r>
     </w:p>
     <w:p>
@@ -849,56 +895,7 @@
         <w:bidi w:val="false"/>
         <w:spacing w:after="120" w:before="240"/>
       </w:pPr>
-      <w:bookmarkStart w:name="_Toc_Education_11" w:id="1"/>
-      <w:r>
-        <w:rPr>
-          <w:rFonts w:ascii="Aptos" w:cs="Aptos" w:eastAsia="Aptos" w:hAnsi="Aptos"/>
-          <w:color w:val="000000"/>
-          <w:sz w:val="28"/>
-          <w:szCs w:val="28"/>
-          <w:rtl w:val="false"/>
-        </w:rPr>
-        <w:t xml:space="preserve">Education</w:t>
-      </w:r>
-      <w:bookmarkEnd w:id="1"/>
-    </w:p>
-    <w:p>
-      <w:pPr>
-        <w:bidi w:val="false"/>
-        <w:spacing w:after="120" w:before="120" w:line="259.20000000000005"/>
-        <w:jc w:val="left"/>
-      </w:pPr>
-      <w:r>
-        <w:rPr>
-          <w:rFonts w:ascii="Aptos" w:cs="Aptos" w:eastAsia="Aptos" w:hAnsi="Aptos"/>
-          <w:b/>
-          <w:bCs/>
-          <w:color w:val="000000"/>
-          <w:sz w:val="24"/>
-          <w:szCs w:val="24"/>
-          <w:rtl w:val="false"/>
-        </w:rPr>
-        <w:t xml:space="preserve">MSc in Computer Science</w:t>
-      </w:r>
-      <w:r>
-        <w:rPr>
-          <w:rFonts w:ascii="Aptos" w:cs="Aptos" w:eastAsia="Aptos" w:hAnsi="Aptos"/>
-          <w:color w:val="000000"/>
-          <w:sz w:val="24"/>
-          <w:szCs w:val="24"/>
-          <w:rtl w:val="false"/>
-        </w:rPr>
-        <w:t xml:space="preserve">, National Technical University, Kharkiv, Ucraina — 2003–2008</w:t>
-      </w:r>
-    </w:p>
-    <w:p>
-      <w:pPr>
-        <w:pStyle w:val="2"/>
-        <w:pStyle w:val="Heading2"/>
-        <w:bidi w:val="false"/>
-        <w:spacing w:after="120" w:before="240"/>
-      </w:pPr>
-      <w:bookmarkStart w:name="_Toc_Languages_12" w:id="1"/>
+      <w:bookmarkStart w:name="_Toc_Languages_15" w:id="1"/>
       <w:r>
         <w:rPr>
           <w:rFonts w:ascii="Aptos" w:cs="Aptos" w:eastAsia="Aptos" w:hAnsi="Aptos"/>

</xml_diff>

<commit_message>
Limit CV history to PDFfiller onward and enforce consistent lists
Reviewed project changes
</commit_message>
<xml_diff>
--- a/registry/jobs/2026-10-04_183713_comparasemplice_it-senior-developer_86fa502f-23b7-4734-acfc-3821ef957d10/application/CV_ValentinNikolaev_comparasemplice_ITSeniorDeveloper.docx
+++ b/registry/jobs/2026-10-04_183713_comparasemplice_it-senior-developer_86fa502f-23b7-4734-acfc-3821ef957d10/application/CV_ValentinNikolaev_comparasemplice_ITSeniorDeveloper.docx
@@ -55,7 +55,7 @@
         </w:rPr>
         <w:t xml:space="preserve">Roma, Italia · +39 351 370 1194 · </w:t>
       </w:r>
-      <w:hyperlink w:history="1" r:id="rIdzmkjr_lbxza5lvaf-bvdr">
+      <w:hyperlink w:history="1" r:id="rIdfxnp0pe3b7ccd_8njpkwx">
         <w:r>
           <w:rPr>
             <w:rFonts w:ascii="Aptos" w:cs="Aptos" w:eastAsia="Aptos" w:hAnsi="Aptos"/>
@@ -85,7 +85,7 @@
         </w:rPr>
         <w:t xml:space="preserve">LinkedIn: </w:t>
       </w:r>
-      <w:hyperlink w:history="1" r:id="rIdz4dnq1eqray0aaectee5h">
+      <w:hyperlink w:history="1" r:id="rIdoljudhbafw1jfbc2ll5sq">
         <w:r>
           <w:rPr>
             <w:rFonts w:ascii="Aptos" w:cs="Aptos" w:eastAsia="Aptos" w:hAnsi="Aptos"/>
@@ -108,7 +108,7 @@
         </w:rPr>
         <w:t xml:space="preserve"> · GitHub: </w:t>
       </w:r>
-      <w:hyperlink w:history="1" r:id="rId4dkq_tb44iy1ildtxpdcw">
+      <w:hyperlink w:history="1" r:id="rIdpcqxpljukhiuir2mismgi">
         <w:r>
           <w:rPr>
             <w:rFonts w:ascii="Aptos" w:cs="Aptos" w:eastAsia="Aptos" w:hAnsi="Aptos"/>
@@ -777,76 +777,12 @@
     </w:p>
     <w:p>
       <w:pPr>
-        <w:pStyle w:val="3"/>
-        <w:pStyle w:val="Heading3"/>
-        <w:bidi w:val="false"/>
-        <w:spacing w:after="120" w:before="240"/>
-        <w:keepNext/>
-      </w:pPr>
-      <w:bookmarkStart w:name="_Toc_Aurum_Software_Senior_Software_Developer_11" w:id="1"/>
-      <w:r>
-        <w:rPr>
-          <w:rFonts w:ascii="Aptos" w:cs="Aptos" w:eastAsia="Aptos" w:hAnsi="Aptos"/>
-          <w:color w:val="000000"/>
-          <w:sz w:val="24"/>
-          <w:szCs w:val="24"/>
-          <w:rtl w:val="false"/>
-        </w:rPr>
-        <w:t xml:space="preserve">Aurum Software — Senior Software Developer | November 2015 – November 2016</w:t>
-      </w:r>
-      <w:bookmarkEnd w:id="1"/>
-    </w:p>
-    <w:p>
-      <w:pPr>
-        <w:pStyle w:val="3"/>
-        <w:pStyle w:val="Heading3"/>
-        <w:bidi w:val="false"/>
-        <w:spacing w:after="120" w:before="240"/>
-        <w:keepNext/>
-      </w:pPr>
-      <w:bookmarkStart w:name="_Toc_Upwork_freelance_Software_Developer_July_12" w:id="1"/>
-      <w:r>
-        <w:rPr>
-          <w:rFonts w:ascii="Aptos" w:cs="Aptos" w:eastAsia="Aptos" w:hAnsi="Aptos"/>
-          <w:color w:val="000000"/>
-          <w:sz w:val="24"/>
-          <w:szCs w:val="24"/>
-          <w:rtl w:val="false"/>
-        </w:rPr>
-        <w:t xml:space="preserve">Upwork freelance — Software Developer | July 2008 – September 2016</w:t>
-      </w:r>
-      <w:bookmarkEnd w:id="1"/>
-    </w:p>
-    <w:p>
-      <w:pPr>
-        <w:pStyle w:val="3"/>
-        <w:pStyle w:val="Heading3"/>
-        <w:bidi w:val="false"/>
-        <w:spacing w:after="120" w:before="240"/>
-        <w:keepNext/>
-      </w:pPr>
-      <w:bookmarkStart w:name="_Toc_CoinsBankbitx_Senior_Software_Developer__13" w:id="1"/>
-      <w:r>
-        <w:rPr>
-          <w:rFonts w:ascii="Aptos" w:cs="Aptos" w:eastAsia="Aptos" w:hAnsi="Aptos"/>
-          <w:color w:val="000000"/>
-          <w:sz w:val="24"/>
-          <w:szCs w:val="24"/>
-          <w:rtl w:val="false"/>
-        </w:rPr>
-        <w:t xml:space="preserve">CoinsBank/bit-x — Senior Software Developer | January 2014 – November 2015</w:t>
-      </w:r>
-      <w:bookmarkEnd w:id="1"/>
-    </w:p>
-    <w:p>
-      <w:pPr>
         <w:pStyle w:val="2"/>
         <w:pStyle w:val="Heading2"/>
         <w:bidi w:val="false"/>
         <w:spacing w:after="120" w:before="240"/>
-        <w:keepNext/>
-      </w:pPr>
-      <w:bookmarkStart w:name="_Toc_Education_14" w:id="1"/>
+      </w:pPr>
+      <w:bookmarkStart w:name="_Toc_Education_11" w:id="1"/>
       <w:r>
         <w:rPr>
           <w:rFonts w:ascii="Aptos" w:cs="Aptos" w:eastAsia="Aptos" w:hAnsi="Aptos"/>
@@ -895,7 +831,7 @@
         <w:bidi w:val="false"/>
         <w:spacing w:after="120" w:before="240"/>
       </w:pPr>
-      <w:bookmarkStart w:name="_Toc_Languages_15" w:id="1"/>
+      <w:bookmarkStart w:name="_Toc_Languages_12" w:id="1"/>
       <w:r>
         <w:rPr>
           <w:rFonts w:ascii="Aptos" w:cs="Aptos" w:eastAsia="Aptos" w:hAnsi="Aptos"/>

</xml_diff>